<commit_message>
Add former spouses, confirmations, PDF page links; rename Case 1 alternate
Co-Authored-By: Claude Opus 5.5 <noreply@anthropic.com>
</commit_message>
<xml_diff>
--- a/Estate_Test_Cases/Case1/Case1_01_Last_Will_and_Testament_Arthur_Pendelton.docx
+++ b/Estate_Test_Cases/Case1/Case1_01_Last_Will_and_Testament_Arthur_Pendelton.docx
@@ -225,7 +225,7 @@
         <w:t xml:space="preserve">Section 4.02 Contingent Residuary Beneficiaries. </w:t>
       </w:r>
       <w:r>
-        <w:t>If Eleanor Vance Pendelton does not survive me by thirty (30) days, I give, devise, and bequeath my Residuary Estate to my descendants who survive me, per stirpes. If neither my primary beneficiary nor any of my descendants survive me, I give my Residuary Estate to my brother, Julian M. Pendelton.</w:t>
+        <w:t>If Eleanor Vance Pendelton does not survive me by thirty (30) days, I give, devise, and bequeath my Residuary Estate to my descendants who survive me, per stirpes. If neither my primary beneficiary nor any of my descendants survive me, I give my Residuary Estate to my brother, Graham M. Pendelton.</w:t>
       </w:r>
     </w:p>
     <w:p>
@@ -253,7 +253,7 @@
         <w:t xml:space="preserve">Section 5.01 Nomination of Executor. </w:t>
       </w:r>
       <w:r>
-        <w:t>I nominate and appoint Eleanor Vance Pendelton, of Austin, Texas, as Independent Executor of this my Last Will and Testament. If Eleanor Vance Pendelton is unable or unwilling to serve, I nominate and appoint Julian M. Pendelton, of Atlanta, Georgia, as Alternate Independent Executor.</w:t>
+        <w:t>I nominate and appoint Eleanor Vance Pendelton, of Austin, Texas, as Independent Executor of this my Last Will and Testament. If Eleanor Vance Pendelton is unable or unwilling to serve, I nominate and appoint Graham M. Pendelton, of Atlanta, Georgia, as Alternate Independent Executor.</w:t>
       </w:r>
     </w:p>
     <w:p>

</xml_diff>